<commit_message>
revert: 移除 sinafin 异步提取，保留 Semaphore(10) 按需加载
- 移除 _run_sinafin_phase1_in_thread 异步提取函数
- 移除 SINAFIN_EXTRACT_SEM 信号量
- /article handler 恢复按需加载，使用 Semaphore(10) 替代旧 1.8s 锁
- 保留 sinafin_rate_limiter.py（Semaphore 10 并发控制）
- reporter article_timeout 恢复 180s
- 新增 sinafin_parallel_design.md 设计文档

Co-Authored-By: Claude <noreply@anthropic.com>
</commit_message>
<xml_diff>
--- a/experiments/report_machine/office/output/上海机场/20260729_上海机场_midday.docx
+++ b/experiments/report_machine/office/output/上海机场/20260729_上海机场_midday.docx
@@ -2,22 +2,6 @@
 <file path=word/document.xml><?xml version="1.0" encoding="utf-8"?>
 <w:document xmlns:wpc="http://schemas.microsoft.com/office/word/2010/wordprocessingCanvas" xmlns:mo="http://schemas.microsoft.com/office/mac/office/2008/main" xmlns:mc="http://schemas.openxmlformats.org/markup-compatibility/2006" xmlns:mv="urn:schemas-microsoft-com:mac:vml" xmlns:o="urn:schemas-microsoft-com:office:office" xmlns:r="http://schemas.openxmlformats.org/officeDocument/2006/relationships" xmlns:m="http://schemas.openxmlformats.org/officeDocument/2006/math" xmlns:v="urn:schemas-microsoft-com:vml" xmlns:wp14="http://schemas.microsoft.com/office/word/2010/wordprocessingDrawing" xmlns:wp="http://schemas.openxmlformats.org/drawingml/2006/wordprocessingDrawing" xmlns:w10="urn:schemas-microsoft-com:office:word" xmlns:w="http://schemas.openxmlformats.org/wordprocessingml/2006/main" xmlns:w14="http://schemas.microsoft.com/office/word/2010/wordml" xmlns:wpg="http://schemas.microsoft.com/office/word/2010/wordprocessingGroup" xmlns:wpi="http://schemas.microsoft.com/office/word/2010/wordprocessingInk" xmlns:wne="http://schemas.microsoft.com/office/word/2006/wordml" xmlns:wps="http://schemas.microsoft.com/office/word/2010/wordprocessingShape" mc:Ignorable="w14 wp14">
   <w:body>
-    <w:p>
-      <w:r>
-        <w:rPr>
-          <w:rFonts w:ascii="Microsoft YaHei" w:hAnsi="Microsoft YaHei"/>
-        </w:rPr>
-        <w:t>所有文章正文均无法获取，我将根据已有的标题摘要及盘中数据进行综合分析。以下是完整的午间分析报告。</w:t>
-      </w:r>
-    </w:p>
-    <w:p>
-      <w:pPr>
-        <w:spacing w:before="240" w:after="240"/>
-        <w:pBdr>
-          <w:bottom w:val="single" w:sz="4" w:space="1" w:color="D0D7DE"/>
-        </w:pBdr>
-      </w:pPr>
-    </w:p>
     <w:p>
       <w:pPr>
         <w:spacing w:before="480" w:after="80" w:line="288" w:lineRule="auto"/>
@@ -75,7 +59,7 @@
         <w:rPr>
           <w:rFonts w:ascii="Microsoft YaHei" w:hAnsi="Microsoft YaHei"/>
         </w:rPr>
-        <w:t xml:space="preserve">今日全市场情绪偏暖，沪市半日成交额达 </w:t>
+        <w:t xml:space="preserve">今日全市场情绪高涨，市场热度达 </w:t>
       </w:r>
       <w:r>
         <w:rPr>
@@ -83,13 +67,13 @@
           <w:b/>
           <w:color w:val="1A1A1A"/>
         </w:rPr>
-        <w:t>1.46万亿元</w:t>
+        <w:t>68（高）</w:t>
       </w:r>
       <w:r>
         <w:rPr>
           <w:rFonts w:ascii="Microsoft YaHei" w:hAnsi="Microsoft YaHei"/>
         </w:rPr>
-        <w:t xml:space="preserve">，较上一交易日放量 </w:t>
+        <w:t xml:space="preserve">，成交额 </w:t>
       </w:r>
       <w:r>
         <w:rPr>
@@ -97,13 +81,13 @@
           <w:b/>
           <w:color w:val="1A1A1A"/>
         </w:rPr>
-        <w:t>+1549亿元</w:t>
+        <w:t>2.06万亿</w:t>
       </w:r>
       <w:r>
         <w:rPr>
           <w:rFonts w:ascii="Microsoft YaHei" w:hAnsi="Microsoft YaHei"/>
         </w:rPr>
-        <w:t xml:space="preserve">。上涨个股 </w:t>
+        <w:t xml:space="preserve">（较前日扩大 </w:t>
       </w:r>
       <w:r>
         <w:rPr>
@@ -111,13 +95,13 @@
           <w:b/>
           <w:color w:val="1A1A1A"/>
         </w:rPr>
-        <w:t>3404家</w:t>
+        <w:t>+2,960亿</w:t>
       </w:r>
       <w:r>
         <w:rPr>
           <w:rFonts w:ascii="Microsoft YaHei" w:hAnsi="Microsoft YaHei"/>
         </w:rPr>
-        <w:t xml:space="preserve">，下跌 </w:t>
+        <w:t xml:space="preserve">）。上涨个股 </w:t>
       </w:r>
       <w:r>
         <w:rPr>
@@ -125,7 +109,21 @@
           <w:b/>
           <w:color w:val="1A1A1A"/>
         </w:rPr>
-        <w:t>2018家</w:t>
+        <w:t>4,090家</w:t>
+      </w:r>
+      <w:r>
+        <w:rPr>
+          <w:rFonts w:ascii="Microsoft YaHei" w:hAnsi="Microsoft YaHei"/>
+        </w:rPr>
+        <w:t xml:space="preserve">，下跌仅 </w:t>
+      </w:r>
+      <w:r>
+        <w:rPr>
+          <w:rFonts w:ascii="Microsoft YaHei" w:hAnsi="Microsoft YaHei"/>
+          <w:b/>
+          <w:color w:val="1A1A1A"/>
+        </w:rPr>
+        <w:t>1,377家</w:t>
       </w:r>
       <w:r>
         <w:rPr>
@@ -139,13 +137,13 @@
           <w:b/>
           <w:color w:val="1A1A1A"/>
         </w:rPr>
-        <w:t>79%</w:t>
+        <w:t>83%</w:t>
       </w:r>
       <w:r>
         <w:rPr>
           <w:rFonts w:ascii="Microsoft YaHei" w:hAnsi="Microsoft YaHei"/>
         </w:rPr>
-        <w:t xml:space="preserve">，涨停 </w:t>
+        <w:t xml:space="preserve">，赚钱效应 </w:t>
       </w:r>
       <w:r>
         <w:rPr>
@@ -153,13 +151,21 @@
           <w:b/>
           <w:color w:val="1A1A1A"/>
         </w:rPr>
-        <w:t>58家</w:t>
+        <w:t>51%</w:t>
       </w:r>
       <w:r>
         <w:rPr>
           <w:rFonts w:ascii="Microsoft YaHei" w:hAnsi="Microsoft YaHei"/>
         </w:rPr>
-        <w:t xml:space="preserve">、跌停 </w:t>
+        <w:t>。涨停梯队方面，一板66只（晋级率9%），三板4只（晋级率33%），高度板1只。整体人气旺盛，属于典型的普涨格局。</w:t>
+      </w:r>
+    </w:p>
+    <w:p>
+      <w:r>
+        <w:rPr>
+          <w:rFonts w:ascii="Microsoft YaHei" w:hAnsi="Microsoft YaHei"/>
+        </w:rPr>
+        <w:t xml:space="preserve">上海机场所属的 </w:t>
       </w:r>
       <w:r>
         <w:rPr>
@@ -167,13 +173,13 @@
           <w:b/>
           <w:color w:val="1A1A1A"/>
         </w:rPr>
-        <w:t>19家</w:t>
+        <w:t>机场服务(A股)板块</w:t>
       </w:r>
       <w:r>
         <w:rPr>
           <w:rFonts w:ascii="Microsoft YaHei" w:hAnsi="Microsoft YaHei"/>
         </w:rPr>
-        <w:t xml:space="preserve">，市场人气较好。赚钱效应指标录得 </w:t>
+        <w:t xml:space="preserve"> 今日上涨 </w:t>
       </w:r>
       <w:r>
         <w:rPr>
@@ -181,13 +187,55 @@
           <w:b/>
           <w:color w:val="1A1A1A"/>
         </w:rPr>
-        <w:t>46%</w:t>
+        <w:t>+0.96%</w:t>
       </w:r>
       <w:r>
         <w:rPr>
           <w:rFonts w:ascii="Microsoft YaHei" w:hAnsi="Microsoft YaHei"/>
         </w:rPr>
-        <w:t>，市场整体赚钱氛围中等偏上。</w:t>
+        <w:t xml:space="preserve">，位列全行业板块第 </w:t>
+      </w:r>
+      <w:r>
+        <w:rPr>
+          <w:rFonts w:ascii="Microsoft YaHei" w:hAnsi="Microsoft YaHei"/>
+          <w:b/>
+          <w:color w:val="1A1A1A"/>
+        </w:rPr>
+        <w:t>128/1158</w:t>
+      </w:r>
+      <w:r>
+        <w:rPr>
+          <w:rFonts w:ascii="Microsoft YaHei" w:hAnsi="Microsoft YaHei"/>
+        </w:rPr>
+        <w:t xml:space="preserve"> 位，板块内 </w:t>
+      </w:r>
+      <w:r>
+        <w:rPr>
+          <w:rFonts w:ascii="Microsoft YaHei" w:hAnsi="Microsoft YaHei"/>
+          <w:b/>
+          <w:color w:val="1A1A1A"/>
+        </w:rPr>
+        <w:t>4只个股全部上涨</w:t>
+      </w:r>
+      <w:r>
+        <w:rPr>
+          <w:rFonts w:ascii="Microsoft YaHei" w:hAnsi="Microsoft YaHei"/>
+        </w:rPr>
+        <w:t xml:space="preserve">，上海机场以 </w:t>
+      </w:r>
+      <w:r>
+        <w:rPr>
+          <w:rFonts w:ascii="Microsoft YaHei" w:hAnsi="Microsoft YaHei"/>
+          <w:b/>
+          <w:color w:val="1A1A1A"/>
+        </w:rPr>
+        <w:t>+1.48%</w:t>
+      </w:r>
+      <w:r>
+        <w:rPr>
+          <w:rFonts w:ascii="Microsoft YaHei" w:hAnsi="Microsoft YaHei"/>
+        </w:rPr>
+        <w:t xml:space="preserve"> 的涨幅领涨该板块。</w:t>
       </w:r>
     </w:p>
     <w:p>
@@ -213,20 +261,6 @@
           <w:sz w:val="28"/>
         </w:rPr>
         <w:t>个股分析</w:t>
-      </w:r>
-    </w:p>
-    <w:p>
-      <w:pPr>
-        <w:spacing w:before="280" w:after="80" w:line="312" w:lineRule="auto"/>
-      </w:pPr>
-      <w:r>
-        <w:rPr>
-          <w:rFonts w:ascii="Microsoft YaHei" w:hAnsi="Microsoft YaHei"/>
-          <w:b/>
-          <w:color w:val="333333"/>
-          <w:sz w:val="24"/>
-        </w:rPr>
-        <w:t>收盘核心数据</w:t>
       </w:r>
     </w:p>
     <w:tbl>
@@ -300,7 +334,7 @@
                 <w:rFonts w:ascii="Microsoft YaHei" w:hAnsi="Microsoft YaHei"/>
                 <w:sz w:val="18"/>
               </w:rPr>
-              <w:t>收盘价</w:t>
+              <w:t>当前价</w:t>
             </w:r>
           </w:p>
         </w:tc>
@@ -382,7 +416,7 @@
                 <w:rFonts w:ascii="Microsoft YaHei" w:hAnsi="Microsoft YaHei"/>
                 <w:sz w:val="18"/>
               </w:rPr>
-              <w:t>开盘/最高/最低</w:t>
+              <w:t>开盘 / 最高 / 最低</w:t>
             </w:r>
           </w:p>
         </w:tc>
@@ -624,45 +658,6 @@
                 <w:rFonts w:ascii="Microsoft YaHei" w:hAnsi="Microsoft YaHei"/>
                 <w:sz w:val="18"/>
               </w:rPr>
-              <w:t>均价</w:t>
-            </w:r>
-          </w:p>
-        </w:tc>
-        <w:tc>
-          <w:tcPr>
-            <w:tcW w:type="dxa" w:w="4533"/>
-          </w:tcPr>
-          <w:p>
-            <w:pPr>
-              <w:spacing w:before="40" w:after="40" w:line="288" w:lineRule="auto"/>
-            </w:pPr>
-            <w:r/>
-            <w:r>
-              <w:rPr>
-                <w:rFonts w:ascii="Microsoft YaHei" w:hAnsi="Microsoft YaHei"/>
-                <w:sz w:val="18"/>
-              </w:rPr>
-              <w:t>23.77 元</w:t>
-            </w:r>
-          </w:p>
-        </w:tc>
-      </w:tr>
-      <w:tr>
-        <w:tc>
-          <w:tcPr>
-            <w:tcW w:type="dxa" w:w="4533"/>
-            <w:shd w:fill="F8F9FA" w:val="clear"/>
-          </w:tcPr>
-          <w:p>
-            <w:pPr>
-              <w:spacing w:before="40" w:after="40" w:line="288" w:lineRule="auto"/>
-            </w:pPr>
-            <w:r/>
-            <w:r>
-              <w:rPr>
-                <w:rFonts w:ascii="Microsoft YaHei" w:hAnsi="Microsoft YaHei"/>
-                <w:sz w:val="18"/>
-              </w:rPr>
               <w:t>动态市盈率</w:t>
             </w:r>
           </w:p>
@@ -670,7 +665,6 @@
         <w:tc>
           <w:tcPr>
             <w:tcW w:type="dxa" w:w="4533"/>
-            <w:shd w:fill="F8F9FA" w:val="clear"/>
           </w:tcPr>
           <w:p>
             <w:pPr>
@@ -693,6 +687,7 @@
         <w:tc>
           <w:tcPr>
             <w:tcW w:type="dxa" w:w="4533"/>
+            <w:shd w:fill="F8F9FA" w:val="clear"/>
           </w:tcPr>
           <w:p>
             <w:pPr>
@@ -711,6 +706,7 @@
         <w:tc>
           <w:tcPr>
             <w:tcW w:type="dxa" w:w="4533"/>
+            <w:shd w:fill="F8F9FA" w:val="clear"/>
           </w:tcPr>
           <w:p>
             <w:pPr>
@@ -733,7 +729,6 @@
         <w:tc>
           <w:tcPr>
             <w:tcW w:type="dxa" w:w="4533"/>
-            <w:shd w:fill="F8F9FA" w:val="clear"/>
           </w:tcPr>
           <w:p>
             <w:pPr>
@@ -745,14 +740,13 @@
                 <w:rFonts w:ascii="Microsoft YaHei" w:hAnsi="Microsoft YaHei"/>
                 <w:sz w:val="18"/>
               </w:rPr>
-              <w:t>总市值（亿元）</w:t>
+              <w:t>总市值 / 流通市值</w:t>
             </w:r>
           </w:p>
         </w:tc>
         <w:tc>
           <w:tcPr>
             <w:tcW w:type="dxa" w:w="4533"/>
-            <w:shd w:fill="F8F9FA" w:val="clear"/>
           </w:tcPr>
           <w:p>
             <w:pPr>
@@ -766,7 +760,7 @@
                 <w:color w:val="1A1A1A"/>
                 <w:sz w:val="18"/>
               </w:rPr>
-              <w:t>595.7</w:t>
+              <w:t>595.7亿 / 489.88亿</w:t>
             </w:r>
           </w:p>
         </w:tc>
@@ -774,56 +768,19 @@
     </w:tbl>
     <w:p/>
     <w:p>
-      <w:pPr>
-        <w:spacing w:before="280" w:after="80" w:line="312" w:lineRule="auto"/>
-      </w:pPr>
-      <w:r>
-        <w:rPr>
-          <w:rFonts w:ascii="Microsoft YaHei" w:hAnsi="Microsoft YaHei"/>
-          <w:b/>
-          <w:color w:val="333333"/>
-          <w:sz w:val="24"/>
-        </w:rPr>
-        <w:t>核心观察</w:t>
-      </w:r>
-    </w:p>
-    <w:p>
-      <w:pPr>
-        <w:pStyle w:val="ListBullet"/>
-      </w:pPr>
-      <w:r>
-        <w:rPr>
-          <w:rFonts w:ascii="Microsoft YaHei" w:hAnsi="Microsoft YaHei"/>
-        </w:rPr>
-        <w:t xml:space="preserve">股价低开高走：今日以 </w:t>
-      </w:r>
       <w:r>
         <w:rPr>
           <w:rFonts w:ascii="Microsoft YaHei" w:hAnsi="Microsoft YaHei"/>
           <w:b/>
           <w:color w:val="1A1A1A"/>
         </w:rPr>
-        <w:t>23.56元</w:t>
+        <w:t>量价分析</w:t>
       </w:r>
       <w:r>
         <w:rPr>
           <w:rFonts w:ascii="Microsoft YaHei" w:hAnsi="Microsoft YaHei"/>
         </w:rPr>
-        <w:t xml:space="preserve">（较昨收 </w:t>
-      </w:r>
-      <w:r>
-        <w:rPr>
-          <w:rFonts w:ascii="Microsoft YaHei" w:hAnsi="Microsoft YaHei"/>
-          <w:b/>
-          <w:color w:val="1A1A1A"/>
-        </w:rPr>
-        <w:t>23.59元</w:t>
-      </w:r>
-      <w:r>
-        <w:rPr>
-          <w:rFonts w:ascii="Microsoft YaHei" w:hAnsi="Microsoft YaHei"/>
-        </w:rPr>
-        <w:t xml:space="preserve"> 低开）开盘，随后震荡上行，盘中最高触及 </w:t>
+        <w:t xml:space="preserve">：今日股价高开（23.56 → 23.94），盘中一度冲高至 </w:t>
       </w:r>
       <w:r>
         <w:rPr>
@@ -837,7 +794,7 @@
         <w:rPr>
           <w:rFonts w:ascii="Microsoft YaHei" w:hAnsi="Microsoft YaHei"/>
         </w:rPr>
-        <w:t xml:space="preserve">，最终收于 </w:t>
+        <w:t xml:space="preserve"> 后回落，最终收于 </w:t>
       </w:r>
       <w:r>
         <w:rPr>
@@ -859,24 +816,13 @@
           <w:b/>
           <w:color w:val="1A1A1A"/>
         </w:rPr>
-        <w:t>1.48%</w:t>
+        <w:t>+1.48%</w:t>
       </w:r>
       <w:r>
         <w:rPr>
           <w:rFonts w:ascii="Microsoft YaHei" w:hAnsi="Microsoft YaHei"/>
         </w:rPr>
-        <w:t>。</w:t>
-      </w:r>
-    </w:p>
-    <w:p>
-      <w:pPr>
-        <w:pStyle w:val="ListBullet"/>
-      </w:pPr>
-      <w:r>
-        <w:rPr>
-          <w:rFonts w:ascii="Microsoft YaHei" w:hAnsi="Microsoft YaHei"/>
-        </w:rPr>
-        <w:t xml:space="preserve">量能放大：半日换手率 </w:t>
+        <w:t xml:space="preserve">。换手率 </w:t>
       </w:r>
       <w:r>
         <w:rPr>
@@ -890,7 +836,7 @@
         <w:rPr>
           <w:rFonts w:ascii="Microsoft YaHei" w:hAnsi="Microsoft YaHei"/>
         </w:rPr>
-        <w:t xml:space="preserve">，较上一交易日全天换手率 </w:t>
+        <w:t xml:space="preserve">，较上一交易日日终换手率 </w:t>
       </w:r>
       <w:r>
         <w:rPr>
@@ -912,13 +858,13 @@
           <w:b/>
           <w:color w:val="1A1A1A"/>
         </w:rPr>
-        <w:t>1.50倍</w:t>
+        <w:t>50%</w:t>
       </w:r>
       <w:r>
         <w:rPr>
           <w:rFonts w:ascii="Microsoft YaHei" w:hAnsi="Microsoft YaHei"/>
         </w:rPr>
-        <w:t xml:space="preserve">，半日成交额已超 </w:t>
+        <w:t>，呈</w:t>
       </w:r>
       <w:r>
         <w:rPr>
@@ -926,24 +872,13 @@
           <w:b/>
           <w:color w:val="1A1A1A"/>
         </w:rPr>
-        <w:t>3.5亿元</w:t>
+        <w:t>放量上涨</w:t>
       </w:r>
       <w:r>
         <w:rPr>
           <w:rFonts w:ascii="Microsoft YaHei" w:hAnsi="Microsoft YaHei"/>
         </w:rPr>
-        <w:t>，显示日内交投活跃度明显提升。</w:t>
-      </w:r>
-    </w:p>
-    <w:p>
-      <w:pPr>
-        <w:pStyle w:val="ListBullet"/>
-      </w:pPr>
-      <w:r>
-        <w:rPr>
-          <w:rFonts w:ascii="Microsoft YaHei" w:hAnsi="Microsoft YaHei"/>
-        </w:rPr>
-        <w:t xml:space="preserve">外盘 </w:t>
+        <w:t xml:space="preserve">态势。量比 </w:t>
       </w:r>
       <w:r>
         <w:rPr>
@@ -951,41 +886,13 @@
           <w:b/>
           <w:color w:val="1A1A1A"/>
         </w:rPr>
-        <w:t>76,794手</w:t>
+        <w:t>1.05</w:t>
       </w:r>
       <w:r>
         <w:rPr>
           <w:rFonts w:ascii="Microsoft YaHei" w:hAnsi="Microsoft YaHei"/>
         </w:rPr>
-        <w:t xml:space="preserve"> 显著大于内盘 </w:t>
-      </w:r>
-      <w:r>
-        <w:rPr>
-          <w:rFonts w:ascii="Microsoft YaHei" w:hAnsi="Microsoft YaHei"/>
-          <w:b/>
-          <w:color w:val="1A1A1A"/>
-        </w:rPr>
-        <w:t>70,528手</w:t>
-      </w:r>
-      <w:r>
-        <w:rPr>
-          <w:rFonts w:ascii="Microsoft YaHei" w:hAnsi="Microsoft YaHei"/>
-        </w:rPr>
-        <w:t xml:space="preserve">（外盘/内盘 ≈ </w:t>
-      </w:r>
-      <w:r>
-        <w:rPr>
-          <w:rFonts w:ascii="Microsoft YaHei" w:hAnsi="Microsoft YaHei"/>
-          <w:b/>
-          <w:color w:val="1A1A1A"/>
-        </w:rPr>
-        <w:t>1.09</w:t>
-      </w:r>
-      <w:r>
-        <w:rPr>
-          <w:rFonts w:ascii="Microsoft YaHei" w:hAnsi="Microsoft YaHei"/>
-        </w:rPr>
-        <w:t>），主动买盘力量占优，与股价上涨方向一致。</w:t>
+        <w:t>，显示今日交投活跃度略高于近期均值。</w:t>
       </w:r>
     </w:p>
     <w:p>
@@ -1024,7 +931,7 @@
           <w:color w:val="333333"/>
           <w:sz w:val="24"/>
         </w:rPr>
-        <w:t>今日盘中资金流向（逐分钟统计至11:30）</w:t>
+        <w:t>今日盘中资金流向（截至11:30）</w:t>
       </w:r>
     </w:p>
     <w:tbl>
@@ -1118,7 +1025,7 @@
                 <w:color w:val="1A1A1A"/>
                 <w:sz w:val="18"/>
               </w:rPr>
-              <w:t>净流入 4,548.74 万元</w:t>
+              <w:t>净流入 5,836.81 万元</w:t>
             </w:r>
           </w:p>
         </w:tc>
@@ -1139,7 +1046,7 @@
                 <w:rFonts w:ascii="Microsoft YaHei" w:hAnsi="Microsoft YaHei"/>
                 <w:sz w:val="18"/>
               </w:rPr>
-              <w:t>资金流入分钟数</w:t>
+              <w:t>资金流入分钟数 / 流出分钟数</w:t>
             </w:r>
           </w:p>
         </w:tc>
@@ -1158,7 +1065,7 @@
                 <w:rFonts w:ascii="Microsoft YaHei" w:hAnsi="Microsoft YaHei"/>
                 <w:sz w:val="18"/>
               </w:rPr>
-              <w:t>63 分钟</w:t>
+              <w:t>110分钟 / 96分钟</w:t>
             </w:r>
           </w:p>
         </w:tc>
@@ -1178,7 +1085,7 @@
                 <w:rFonts w:ascii="Microsoft YaHei" w:hAnsi="Microsoft YaHei"/>
                 <w:sz w:val="18"/>
               </w:rPr>
-              <w:t>资金流出分钟数</w:t>
+              <w:t>最大单分钟流入</w:t>
             </w:r>
           </w:p>
         </w:tc>
@@ -1194,9 +1101,11 @@
             <w:r>
               <w:rPr>
                 <w:rFonts w:ascii="Microsoft YaHei" w:hAnsi="Microsoft YaHei"/>
+                <w:b/>
+                <w:color w:val="1A1A1A"/>
                 <w:sz w:val="18"/>
               </w:rPr>
-              <w:t>50 分钟</w:t>
+              <w:t>665.5 万元</w:t>
             </w:r>
           </w:p>
         </w:tc>
@@ -1217,7 +1126,7 @@
                 <w:rFonts w:ascii="Microsoft YaHei" w:hAnsi="Microsoft YaHei"/>
                 <w:sz w:val="18"/>
               </w:rPr>
-              <w:t>最大单分钟流入</w:t>
+              <w:t>最大单分钟流出</w:t>
             </w:r>
           </w:p>
         </w:tc>
@@ -1225,46 +1134,6 @@
           <w:tcPr>
             <w:tcW w:type="dxa" w:w="4533"/>
             <w:shd w:fill="F8F9FA" w:val="clear"/>
-          </w:tcPr>
-          <w:p>
-            <w:pPr>
-              <w:spacing w:before="40" w:after="40" w:line="288" w:lineRule="auto"/>
-            </w:pPr>
-            <w:r/>
-            <w:r>
-              <w:rPr>
-                <w:rFonts w:ascii="Microsoft YaHei" w:hAnsi="Microsoft YaHei"/>
-                <w:b/>
-                <w:color w:val="1A1A1A"/>
-                <w:sz w:val="18"/>
-              </w:rPr>
-              <w:t>515.0 万元</w:t>
-            </w:r>
-          </w:p>
-        </w:tc>
-      </w:tr>
-      <w:tr>
-        <w:tc>
-          <w:tcPr>
-            <w:tcW w:type="dxa" w:w="4533"/>
-          </w:tcPr>
-          <w:p>
-            <w:pPr>
-              <w:spacing w:before="40" w:after="40" w:line="288" w:lineRule="auto"/>
-            </w:pPr>
-            <w:r/>
-            <w:r>
-              <w:rPr>
-                <w:rFonts w:ascii="Microsoft YaHei" w:hAnsi="Microsoft YaHei"/>
-                <w:sz w:val="18"/>
-              </w:rPr>
-              <w:t>最大单分钟流出</w:t>
-            </w:r>
-          </w:p>
-        </w:tc>
-        <w:tc>
-          <w:tcPr>
-            <w:tcW w:type="dxa" w:w="4533"/>
           </w:tcPr>
           <w:p>
             <w:pPr>
@@ -1283,36 +1152,6 @@
       </w:tr>
     </w:tbl>
     <w:p/>
-    <w:p>
-      <w:r>
-        <w:rPr>
-          <w:rFonts w:ascii="Microsoft YaHei" w:hAnsi="Microsoft YaHei"/>
-          <w:b/>
-          <w:color w:val="1A1A1A"/>
-        </w:rPr>
-        <w:t>资金面解读：</w:t>
-      </w:r>
-      <w:r>
-        <w:rPr>
-          <w:rFonts w:ascii="Microsoft YaHei" w:hAnsi="Microsoft YaHei"/>
-        </w:rPr>
-        <w:t xml:space="preserve"> 资金净流入近 </w:t>
-      </w:r>
-      <w:r>
-        <w:rPr>
-          <w:rFonts w:ascii="Microsoft YaHei" w:hAnsi="Microsoft YaHei"/>
-          <w:b/>
-          <w:color w:val="1A1A1A"/>
-        </w:rPr>
-        <w:t>4,549万元</w:t>
-      </w:r>
-      <w:r>
-        <w:rPr>
-          <w:rFonts w:ascii="Microsoft YaHei" w:hAnsi="Microsoft YaHei"/>
-        </w:rPr>
-        <w:t>，在113个统计分钟中，资金流入分钟（63分钟）明显多于流出分钟（50分钟），且最大单分钟流入（515万元）远超最大单分钟流出（143.2万元），显示资金入场意愿较强，盘中多头力量占据主导。</w:t>
-      </w:r>
-    </w:p>
     <w:p>
       <w:pPr>
         <w:spacing w:before="280" w:after="80" w:line="312" w:lineRule="auto"/>
@@ -1440,6 +1279,8 @@
             <w:r>
               <w:rPr>
                 <w:rFonts w:ascii="Microsoft YaHei" w:hAnsi="Microsoft YaHei"/>
+                <w:b/>
+                <w:color w:val="1A1A1A"/>
                 <w:sz w:val="18"/>
               </w:rPr>
               <w:t>大单</w:t>
@@ -1462,7 +1303,7 @@
                 <w:color w:val="1A1A1A"/>
                 <w:sz w:val="18"/>
               </w:rPr>
-              <w:t>+22,376,722</w:t>
+              <w:t>+31,430,087</w:t>
             </w:r>
           </w:p>
         </w:tc>
@@ -1480,7 +1321,7 @@
                 <w:rFonts w:ascii="Microsoft YaHei" w:hAnsi="Microsoft YaHei"/>
                 <w:sz w:val="18"/>
               </w:rPr>
-              <w:t>35,440,986</w:t>
+              <w:t>45,362,326</w:t>
             </w:r>
           </w:p>
         </w:tc>
@@ -1498,7 +1339,7 @@
                 <w:rFonts w:ascii="Microsoft YaHei" w:hAnsi="Microsoft YaHei"/>
                 <w:sz w:val="18"/>
               </w:rPr>
-              <w:t>13,064,242</w:t>
+              <w:t>13,932,239</w:t>
             </w:r>
           </w:p>
         </w:tc>
@@ -1517,6 +1358,8 @@
             <w:r>
               <w:rPr>
                 <w:rFonts w:ascii="Microsoft YaHei" w:hAnsi="Microsoft YaHei"/>
+                <w:b/>
+                <w:color w:val="1A1A1A"/>
                 <w:sz w:val="18"/>
               </w:rPr>
               <w:t>中单</w:t>
@@ -1540,7 +1383,7 @@
                 <w:color w:val="1A1A1A"/>
                 <w:sz w:val="18"/>
               </w:rPr>
-              <w:t>+22,424,821</w:t>
+              <w:t>+27,522,662</w:t>
             </w:r>
           </w:p>
         </w:tc>
@@ -1559,7 +1402,7 @@
                 <w:rFonts w:ascii="Microsoft YaHei" w:hAnsi="Microsoft YaHei"/>
                 <w:sz w:val="18"/>
               </w:rPr>
-              <w:t>70,914,783</w:t>
+              <w:t>101,332,150</w:t>
             </w:r>
           </w:p>
         </w:tc>
@@ -1578,7 +1421,7 @@
                 <w:rFonts w:ascii="Microsoft YaHei" w:hAnsi="Microsoft YaHei"/>
                 <w:sz w:val="18"/>
               </w:rPr>
-              <w:t>48,489,962</w:t>
+              <w:t>73,809,488</w:t>
             </w:r>
           </w:p>
         </w:tc>
@@ -1614,11 +1457,9 @@
             <w:r>
               <w:rPr>
                 <w:rFonts w:ascii="Microsoft YaHei" w:hAnsi="Microsoft YaHei"/>
-                <w:b/>
-                <w:color w:val="1A1A1A"/>
                 <w:sz w:val="18"/>
               </w:rPr>
-              <w:t>+639,413</w:t>
+              <w:t>-599,269</w:t>
             </w:r>
           </w:p>
         </w:tc>
@@ -1636,7 +1477,7 @@
                 <w:rFonts w:ascii="Microsoft YaHei" w:hAnsi="Microsoft YaHei"/>
                 <w:sz w:val="18"/>
               </w:rPr>
-              <w:t>18,233,867</w:t>
+              <w:t>30,374,584</w:t>
             </w:r>
           </w:p>
         </w:tc>
@@ -1654,7 +1495,7 @@
                 <w:rFonts w:ascii="Microsoft YaHei" w:hAnsi="Microsoft YaHei"/>
                 <w:sz w:val="18"/>
               </w:rPr>
-              <w:t>17,594,454</w:t>
+              <w:t>30,973,853</w:t>
             </w:r>
           </w:p>
         </w:tc>
@@ -1673,6 +1514,8 @@
             <w:r>
               <w:rPr>
                 <w:rFonts w:ascii="Microsoft YaHei" w:hAnsi="Microsoft YaHei"/>
+                <w:b/>
+                <w:color w:val="1A1A1A"/>
                 <w:sz w:val="18"/>
               </w:rPr>
               <w:t>合计</w:t>
@@ -1696,7 +1539,7 @@
                 <w:color w:val="1A1A1A"/>
                 <w:sz w:val="18"/>
               </w:rPr>
-              <w:t>+45,440,956</w:t>
+              <w:t>+58,353,480</w:t>
             </w:r>
           </w:p>
         </w:tc>
@@ -1745,8 +1588,16 @@
       <w:r>
         <w:rPr>
           <w:rFonts w:ascii="Microsoft YaHei" w:hAnsi="Microsoft YaHei"/>
+          <w:b/>
+          <w:color w:val="1A1A1A"/>
         </w:rPr>
-        <w:t xml:space="preserve">上一个交易日大单与中单均呈 </w:t>
+        <w:t>资金面解读</w:t>
+      </w:r>
+      <w:r>
+        <w:rPr>
+          <w:rFonts w:ascii="Microsoft YaHei" w:hAnsi="Microsoft YaHei"/>
+        </w:rPr>
+        <w:t xml:space="preserve">：今日盘中延续了上一交易日的资金净流入态势，半日已净流入 </w:t>
       </w:r>
       <w:r>
         <w:rPr>
@@ -1754,13 +1605,13 @@
           <w:b/>
           <w:color w:val="1A1A1A"/>
         </w:rPr>
-        <w:t>净流入</w:t>
+        <w:t>5,836万元</w:t>
       </w:r>
       <w:r>
         <w:rPr>
           <w:rFonts w:ascii="Microsoft YaHei" w:hAnsi="Microsoft YaHei"/>
         </w:rPr>
-        <w:t xml:space="preserve">状态，大单净额 </w:t>
+        <w:t xml:space="preserve">。从细分数据看，大单和中单均呈显著净流入，大单净额 </w:t>
       </w:r>
       <w:r>
         <w:rPr>
@@ -1768,13 +1619,13 @@
           <w:b/>
           <w:color w:val="1A1A1A"/>
         </w:rPr>
-        <w:t>+2,237.67万元</w:t>
+        <w:t>+3,143万</w:t>
       </w:r>
       <w:r>
         <w:rPr>
           <w:rFonts w:ascii="Microsoft YaHei" w:hAnsi="Microsoft YaHei"/>
         </w:rPr>
-        <w:t xml:space="preserve">，中单净额 </w:t>
+        <w:t xml:space="preserve"> 尤为突出，显示</w:t>
       </w:r>
       <w:r>
         <w:rPr>
@@ -1782,13 +1633,13 @@
           <w:b/>
           <w:color w:val="1A1A1A"/>
         </w:rPr>
-        <w:t>+2,242.48万元</w:t>
+        <w:t>主力资金主动买入意愿较强</w:t>
       </w:r>
       <w:r>
         <w:rPr>
           <w:rFonts w:ascii="Microsoft YaHei" w:hAnsi="Microsoft YaHei"/>
         </w:rPr>
-        <w:t>，机构与主力资金已提前布局，今日资金延续净流入态势。</w:t>
+        <w:t>。小单呈现微幅净流出，说明散户筹码正在向主力集中，筹码结构改善。</w:t>
       </w:r>
     </w:p>
     <w:p>
@@ -1802,7 +1653,7 @@
           <w:color w:val="333333"/>
           <w:sz w:val="24"/>
         </w:rPr>
-        <w:t>融资融券（上一个交易日终）</w:t>
+        <w:t>融资融券（上一交易日日终）</w:t>
       </w:r>
     </w:p>
     <w:tbl>
@@ -1878,7 +1729,7 @@
                 <w:color w:val="1A1A1A"/>
                 <w:sz w:val="18"/>
               </w:rPr>
-              <w:t>较前日变动</w:t>
+              <w:t>较前日变化</w:t>
             </w:r>
           </w:p>
         </w:tc>
@@ -1918,7 +1769,7 @@
                 <w:color w:val="1A1A1A"/>
                 <w:sz w:val="18"/>
               </w:rPr>
-              <w:t>16.71亿元</w:t>
+              <w:t>16.71亿</w:t>
             </w:r>
           </w:p>
         </w:tc>
@@ -1939,13 +1790,6 @@
                 <w:sz w:val="18"/>
               </w:rPr>
               <w:t>-0.45%</w:t>
-            </w:r>
-            <w:r>
-              <w:rPr>
-                <w:rFonts w:ascii="Microsoft YaHei" w:hAnsi="Microsoft YaHei"/>
-                <w:sz w:val="18"/>
-              </w:rPr>
-              <w:t>（净偿还757.4万元）</w:t>
             </w:r>
           </w:p>
         </w:tc>
@@ -1987,7 +1831,7 @@
                 <w:color w:val="1A1A1A"/>
                 <w:sz w:val="18"/>
               </w:rPr>
-              <w:t>0.03亿元</w:t>
+              <w:t>0.03亿</w:t>
             </w:r>
           </w:p>
         </w:tc>
@@ -2020,35 +1864,7 @@
         <w:rPr>
           <w:rFonts w:ascii="Microsoft YaHei" w:hAnsi="Microsoft YaHei"/>
         </w:rPr>
-        <w:t xml:space="preserve">融资余额占流通市值比例约 </w:t>
-      </w:r>
-      <w:r>
-        <w:rPr>
-          <w:rFonts w:ascii="Microsoft YaHei" w:hAnsi="Microsoft YaHei"/>
-          <w:b/>
-          <w:color w:val="1A1A1A"/>
-        </w:rPr>
-        <w:t>3.40%</w:t>
-      </w:r>
-      <w:r>
-        <w:rPr>
-          <w:rFonts w:ascii="Microsoft YaHei" w:hAnsi="Microsoft YaHei"/>
-        </w:rPr>
-        <w:t xml:space="preserve">，超过近一年60%分位水平。上一个交易日融资净偿还 </w:t>
-      </w:r>
-      <w:r>
-        <w:rPr>
-          <w:rFonts w:ascii="Microsoft YaHei" w:hAnsi="Microsoft YaHei"/>
-          <w:b/>
-          <w:color w:val="1A1A1A"/>
-        </w:rPr>
-        <w:t>757.4万元</w:t>
-      </w:r>
-      <w:r>
-        <w:rPr>
-          <w:rFonts w:ascii="Microsoft YaHei" w:hAnsi="Microsoft YaHei"/>
-        </w:rPr>
-        <w:t>，融券余额亦小幅下降，杠杆资金整体偏谨慎但规模仍处高位。</w:t>
+        <w:t>融资余额小幅下降，融券余额同步缩减，杠杆资金整体保持稳定，未见异常波动。</w:t>
       </w:r>
     </w:p>
     <w:p>
@@ -2087,7 +1903,7 @@
           <w:color w:val="333333"/>
           <w:sz w:val="24"/>
         </w:rPr>
-        <w:t>均线系统与布林带定位</w:t>
+        <w:t>均线系统</w:t>
       </w:r>
     </w:p>
     <w:tbl>
@@ -2121,7 +1937,7 @@
                 <w:color w:val="1A1A1A"/>
                 <w:sz w:val="18"/>
               </w:rPr>
-              <w:t>技术指标</w:t>
+              <w:t>均线</w:t>
             </w:r>
           </w:p>
         </w:tc>
@@ -2142,7 +1958,7 @@
                 <w:color w:val="1A1A1A"/>
                 <w:sz w:val="18"/>
               </w:rPr>
-              <w:t>位置（元）</w:t>
+              <w:t>价格（元）</w:t>
             </w:r>
           </w:p>
         </w:tc>
@@ -2163,7 +1979,7 @@
                 <w:color w:val="1A1A1A"/>
                 <w:sz w:val="18"/>
               </w:rPr>
-              <w:t>当前价偏离度</w:t>
+              <w:t>当前位置偏离度</w:t>
             </w:r>
           </w:p>
         </w:tc>
@@ -2196,13 +2012,6 @@
               <w:spacing w:before="40" w:after="40" w:line="288" w:lineRule="auto"/>
             </w:pPr>
             <w:r/>
-            <w:r>
-              <w:rPr>
-                <w:rFonts w:ascii="Microsoft YaHei" w:hAnsi="Microsoft YaHei"/>
-                <w:sz w:val="18"/>
-              </w:rPr>
-              <w:t xml:space="preserve">约 </w:t>
-            </w:r>
             <w:r>
               <w:rPr>
                 <w:rFonts w:ascii="Microsoft YaHei" w:hAnsi="Microsoft YaHei"/>
@@ -2239,13 +2048,6 @@
               </w:rPr>
               <w:t>+0.2%</w:t>
             </w:r>
-            <w:r>
-              <w:rPr>
-                <w:rFonts w:ascii="Microsoft YaHei" w:hAnsi="Microsoft YaHei"/>
-                <w:sz w:val="18"/>
-              </w:rPr>
-              <w:t>，紧贴</w:t>
-            </w:r>
           </w:p>
         </w:tc>
       </w:tr>
@@ -2279,13 +2081,6 @@
               <w:spacing w:before="40" w:after="40" w:line="288" w:lineRule="auto"/>
             </w:pPr>
             <w:r/>
-            <w:r>
-              <w:rPr>
-                <w:rFonts w:ascii="Microsoft YaHei" w:hAnsi="Microsoft YaHei"/>
-                <w:sz w:val="18"/>
-              </w:rPr>
-              <w:t xml:space="preserve">约 </w:t>
-            </w:r>
             <w:r>
               <w:rPr>
                 <w:rFonts w:ascii="Microsoft YaHei" w:hAnsi="Microsoft YaHei"/>
@@ -2341,7 +2136,7 @@
                 <w:rFonts w:ascii="Microsoft YaHei" w:hAnsi="Microsoft YaHei"/>
                 <w:sz w:val="18"/>
               </w:rPr>
-              <w:t>MA20 / 布林中轨</w:t>
+              <w:t>MA20（布林中轨）</w:t>
             </w:r>
           </w:p>
         </w:tc>
@@ -2354,13 +2149,6 @@
               <w:spacing w:before="40" w:after="40" w:line="288" w:lineRule="auto"/>
             </w:pPr>
             <w:r/>
-            <w:r>
-              <w:rPr>
-                <w:rFonts w:ascii="Microsoft YaHei" w:hAnsi="Microsoft YaHei"/>
-                <w:sz w:val="18"/>
-              </w:rPr>
-              <w:t xml:space="preserve">约 </w:t>
-            </w:r>
             <w:r>
               <w:rPr>
                 <w:rFonts w:ascii="Microsoft YaHei" w:hAnsi="Microsoft YaHei"/>
@@ -2433,8 +2221,6 @@
             <w:r>
               <w:rPr>
                 <w:rFonts w:ascii="Microsoft YaHei" w:hAnsi="Microsoft YaHei"/>
-                <w:b/>
-                <w:color w:val="1A1A1A"/>
                 <w:sz w:val="18"/>
               </w:rPr>
               <w:t>24.26</w:t>
@@ -2456,7 +2242,7 @@
                 <w:rFonts w:ascii="Microsoft YaHei" w:hAnsi="Microsoft YaHei"/>
                 <w:sz w:val="18"/>
               </w:rPr>
-              <w:t xml:space="preserve">下方 </w:t>
+              <w:t xml:space="preserve">距当前价 </w:t>
             </w:r>
             <w:r>
               <w:rPr>
@@ -2501,8 +2287,6 @@
             <w:r>
               <w:rPr>
                 <w:rFonts w:ascii="Microsoft YaHei" w:hAnsi="Microsoft YaHei"/>
-                <w:b/>
-                <w:color w:val="1A1A1A"/>
                 <w:sz w:val="18"/>
               </w:rPr>
               <w:t>22.22</w:t>
@@ -2523,7 +2307,16 @@
                 <w:rFonts w:ascii="Microsoft YaHei" w:hAnsi="Microsoft YaHei"/>
                 <w:sz w:val="18"/>
               </w:rPr>
-              <w:t>—</w:t>
+              <w:t xml:space="preserve">距当前价 </w:t>
+            </w:r>
+            <w:r>
+              <w:rPr>
+                <w:rFonts w:ascii="Microsoft YaHei" w:hAnsi="Microsoft YaHei"/>
+                <w:b/>
+                <w:color w:val="1A1A1A"/>
+                <w:sz w:val="18"/>
+              </w:rPr>
+              <w:t>+7.7%</w:t>
             </w:r>
           </w:p>
         </w:tc>
@@ -2537,26 +2330,24 @@
           <w:b/>
           <w:color w:val="1A1A1A"/>
         </w:rPr>
-        <w:t>技术形态研判：</w:t>
-      </w:r>
-    </w:p>
-    <w:p>
-      <w:pPr>
-        <w:pStyle w:val="ListNumber"/>
-      </w:pPr>
-      <w:r>
-        <w:rPr>
-          <w:rFonts w:ascii="Microsoft YaHei" w:hAnsi="Microsoft YaHei"/>
-          <w:b/>
-          <w:color w:val="1A1A1A"/>
-        </w:rPr>
-        <w:t>多头排列初步形成</w:t>
+        <w:t>技术研判</w:t>
       </w:r>
       <w:r>
         <w:rPr>
           <w:rFonts w:ascii="Microsoft YaHei" w:hAnsi="Microsoft YaHei"/>
         </w:rPr>
-        <w:t xml:space="preserve">：当前价 </w:t>
+        <w:t>：</w:t>
+      </w:r>
+    </w:p>
+    <w:p>
+      <w:pPr>
+        <w:pStyle w:val="ListBullet"/>
+      </w:pPr>
+      <w:r>
+        <w:rPr>
+          <w:rFonts w:ascii="Microsoft YaHei" w:hAnsi="Microsoft YaHei"/>
+        </w:rPr>
+        <w:t xml:space="preserve">股价 </w:t>
       </w:r>
       <w:r>
         <w:rPr>
@@ -2570,7 +2361,7 @@
         <w:rPr>
           <w:rFonts w:ascii="Microsoft YaHei" w:hAnsi="Microsoft YaHei"/>
         </w:rPr>
-        <w:t xml:space="preserve"> 站上MA5（23.89）、MA10（23.54）及MA20（23.24）三线之上，均线系统呈 </w:t>
+        <w:t xml:space="preserve"> 稳稳站在 MA5（23.89）、MA10（23.54）、MA20（23.24）三条均线之上，呈</w:t>
       </w:r>
       <w:r>
         <w:rPr>
@@ -2584,54 +2375,18 @@
         <w:rPr>
           <w:rFonts w:ascii="Microsoft YaHei" w:hAnsi="Microsoft YaHei"/>
         </w:rPr>
-        <w:t>。</w:t>
+        <w:t>格局</w:t>
       </w:r>
     </w:p>
     <w:p>
       <w:pPr>
-        <w:pStyle w:val="ListNumber"/>
+        <w:pStyle w:val="ListBullet"/>
       </w:pPr>
       <w:r>
         <w:rPr>
           <w:rFonts w:ascii="Microsoft YaHei" w:hAnsi="Microsoft YaHei"/>
-          <w:b/>
-          <w:color w:val="1A1A1A"/>
         </w:rPr>
-        <w:t>短期动量延续</w:t>
-      </w:r>
-      <w:r>
-        <w:rPr>
-          <w:rFonts w:ascii="Microsoft YaHei" w:hAnsi="Microsoft YaHei"/>
-        </w:rPr>
-        <w:t xml:space="preserve">：股价已突破MA20/布林中轨 </w:t>
-      </w:r>
-      <w:r>
-        <w:rPr>
-          <w:rFonts w:ascii="Microsoft YaHei" w:hAnsi="Microsoft YaHei"/>
-          <w:b/>
-          <w:color w:val="1A1A1A"/>
-        </w:rPr>
-        <w:t>3.0%</w:t>
-      </w:r>
-      <w:r>
-        <w:rPr>
-          <w:rFonts w:ascii="Microsoft YaHei" w:hAnsi="Microsoft YaHei"/>
-        </w:rPr>
-        <w:t xml:space="preserve">，中短期趋势转强。盘中最高 </w:t>
-      </w:r>
-      <w:r>
-        <w:rPr>
-          <w:rFonts w:ascii="Microsoft YaHei" w:hAnsi="Microsoft YaHei"/>
-          <w:b/>
-          <w:color w:val="1A1A1A"/>
-        </w:rPr>
-        <w:t>24.02元</w:t>
-      </w:r>
-      <w:r>
-        <w:rPr>
-          <w:rFonts w:ascii="Microsoft YaHei" w:hAnsi="Microsoft YaHei"/>
-        </w:rPr>
-        <w:t xml:space="preserve"> 逼近布林带上轨 </w:t>
+        <w:t xml:space="preserve">当前价格距离布林带上轨 </w:t>
       </w:r>
       <w:r>
         <w:rPr>
@@ -2645,26 +2400,7 @@
         <w:rPr>
           <w:rFonts w:ascii="Microsoft YaHei" w:hAnsi="Microsoft YaHei"/>
         </w:rPr>
-        <w:t>，上方存在一定技术阻力。</w:t>
-      </w:r>
-    </w:p>
-    <w:p>
-      <w:pPr>
-        <w:pStyle w:val="ListNumber"/>
-      </w:pPr>
-      <w:r>
-        <w:rPr>
-          <w:rFonts w:ascii="Microsoft YaHei" w:hAnsi="Microsoft YaHei"/>
-          <w:b/>
-          <w:color w:val="1A1A1A"/>
-        </w:rPr>
-        <w:t>偏离度健康</w:t>
-      </w:r>
-      <w:r>
-        <w:rPr>
-          <w:rFonts w:ascii="Microsoft YaHei" w:hAnsi="Microsoft YaHei"/>
-        </w:rPr>
-        <w:t xml:space="preserve">：当前价距MA5仅 </w:t>
+        <w:t xml:space="preserve"> 仅 </w:t>
       </w:r>
       <w:r>
         <w:rPr>
@@ -2672,13 +2408,71 @@
           <w:b/>
           <w:color w:val="1A1A1A"/>
         </w:rPr>
-        <w:t>+0.2%</w:t>
+        <w:t>1.3%</w:t>
       </w:r>
       <w:r>
         <w:rPr>
           <w:rFonts w:ascii="Microsoft YaHei" w:hAnsi="Microsoft YaHei"/>
         </w:rPr>
-        <w:t>，未出现过度拉升后的偏离，短期走势健康。</w:t>
+        <w:t xml:space="preserve"> 空间，处于布林带</w:t>
+      </w:r>
+      <w:r>
+        <w:rPr>
+          <w:rFonts w:ascii="Microsoft YaHei" w:hAnsi="Microsoft YaHei"/>
+          <w:b/>
+          <w:color w:val="1A1A1A"/>
+        </w:rPr>
+        <w:t>中轨与上轨之间</w:t>
+      </w:r>
+      <w:r>
+        <w:rPr>
+          <w:rFonts w:ascii="Microsoft YaHei" w:hAnsi="Microsoft YaHei"/>
+        </w:rPr>
+        <w:t>的偏强区域</w:t>
+      </w:r>
+    </w:p>
+    <w:p>
+      <w:pPr>
+        <w:pStyle w:val="ListBullet"/>
+      </w:pPr>
+      <w:r>
+        <w:rPr>
+          <w:rFonts w:ascii="Microsoft YaHei" w:hAnsi="Microsoft YaHei"/>
+        </w:rPr>
+        <w:t>MA5 与 MA10 呈发散向上趋势（23.89 &gt; 23.54），</w:t>
+      </w:r>
+      <w:r>
+        <w:rPr>
+          <w:rFonts w:ascii="Microsoft YaHei" w:hAnsi="Microsoft YaHei"/>
+          <w:b/>
+          <w:color w:val="1A1A1A"/>
+        </w:rPr>
+        <w:t>短期趋势向好</w:t>
+      </w:r>
+    </w:p>
+    <w:p>
+      <w:pPr>
+        <w:pStyle w:val="ListBullet"/>
+      </w:pPr>
+      <w:r>
+        <w:rPr>
+          <w:rFonts w:ascii="Microsoft YaHei" w:hAnsi="Microsoft YaHei"/>
+        </w:rPr>
+        <w:t xml:space="preserve">偏离 MA20 约 </w:t>
+      </w:r>
+      <w:r>
+        <w:rPr>
+          <w:rFonts w:ascii="Microsoft YaHei" w:hAnsi="Microsoft YaHei"/>
+          <w:b/>
+          <w:color w:val="1A1A1A"/>
+        </w:rPr>
+        <w:t>+3.0%</w:t>
+      </w:r>
+      <w:r>
+        <w:rPr>
+          <w:rFonts w:ascii="Microsoft YaHei" w:hAnsi="Microsoft YaHei"/>
+        </w:rPr>
+        <w:t>，既未出现超买过热，又保持了足够的上涨弹性</w:t>
       </w:r>
     </w:p>
     <w:p>
@@ -2707,43 +2501,55 @@
       </w:r>
     </w:p>
     <w:p>
+      <w:r>
+        <w:rPr>
+          <w:rFonts w:ascii="Microsoft YaHei" w:hAnsi="Microsoft YaHei"/>
+        </w:rPr>
+        <w:t>今日相关资讯仅有一条隔夜全球要闻，主要涉及：</w:t>
+      </w:r>
+    </w:p>
+    <w:p>
       <w:pPr>
-        <w:spacing w:before="280" w:after="80" w:line="312" w:lineRule="auto"/>
+        <w:pStyle w:val="ListNumber"/>
       </w:pPr>
       <w:r>
         <w:rPr>
           <w:rFonts w:ascii="Microsoft YaHei" w:hAnsi="Microsoft YaHei"/>
-          <w:b/>
-          <w:color w:val="333333"/>
-          <w:sz w:val="24"/>
         </w:rPr>
-        <w:t>重要快讯解读</w:t>
+        <w:t xml:space="preserve">伊朗提出霍尔木兹海峡双向航运管理方案，油价大跌（WTI跌 </w:t>
       </w:r>
-    </w:p>
-    <w:p>
       <w:r>
         <w:rPr>
           <w:rFonts w:ascii="Microsoft YaHei" w:hAnsi="Microsoft YaHei"/>
           <w:b/>
           <w:color w:val="1A1A1A"/>
         </w:rPr>
-        <w:t>1. 隔夜全球要闻（相关度0.38）</w:t>
+        <w:t>4.06%</w:t>
+      </w:r>
+      <w:r>
+        <w:rPr>
+          <w:rFonts w:ascii="Microsoft YaHei" w:hAnsi="Microsoft YaHei"/>
+        </w:rPr>
+        <w:t xml:space="preserve">，布油跌 </w:t>
+      </w:r>
+      <w:r>
+        <w:rPr>
+          <w:rFonts w:ascii="Microsoft YaHei" w:hAnsi="Microsoft YaHei"/>
+          <w:b/>
+          <w:color w:val="1A1A1A"/>
+        </w:rPr>
+        <w:t>4.83%</w:t>
+      </w:r>
+      <w:r>
+        <w:rPr>
+          <w:rFonts w:ascii="Microsoft YaHei" w:hAnsi="Microsoft YaHei"/>
+        </w:rPr>
+        <w:t>）</w:t>
       </w:r>
     </w:p>
     <w:p>
       <w:pPr>
-        <w:pStyle w:val="ListBullet"/>
-      </w:pPr>
-      <w:r>
-        <w:rPr>
-          <w:rFonts w:ascii="Microsoft YaHei" w:hAnsi="Microsoft YaHei"/>
-        </w:rPr>
-        <w:t>伊朗提议由伊朗负责管理霍尔木兹海峡一侧的单向航运通行，涉及航运安全议题。</w:t>
-      </w:r>
-    </w:p>
-    <w:p>
-      <w:pPr>
-        <w:pStyle w:val="ListBullet"/>
+        <w:pStyle w:val="ListNumber"/>
       </w:pPr>
       <w:r>
         <w:rPr>
@@ -2759,11 +2565,32 @@
         </w:rPr>
         <w:t>4.49%</w:t>
       </w:r>
+    </w:p>
+    <w:p>
+      <w:pPr>
+        <w:pStyle w:val="ListNumber"/>
+      </w:pPr>
       <w:r>
         <w:rPr>
           <w:rFonts w:ascii="Microsoft YaHei" w:hAnsi="Microsoft YaHei"/>
         </w:rPr>
-        <w:t xml:space="preserve">，Roundhill存储ETF跌 </w:t>
+        <w:t>特朗普称希望避免袭击伊朗的桥梁和发电厂</w:t>
+      </w:r>
+    </w:p>
+    <w:p>
+      <w:r>
+        <w:rPr>
+          <w:rFonts w:ascii="Microsoft YaHei" w:hAnsi="Microsoft YaHei"/>
+          <w:b/>
+          <w:color w:val="1A1A1A"/>
+        </w:rPr>
+        <w:t>影响分析</w:t>
+      </w:r>
+      <w:r>
+        <w:rPr>
+          <w:rFonts w:ascii="Microsoft YaHei" w:hAnsi="Microsoft YaHei"/>
+        </w:rPr>
+        <w:t xml:space="preserve">：该新闻与上海机场的直接关联度较低（关键词匹配度 </w:t>
       </w:r>
       <w:r>
         <w:rPr>
@@ -2771,13 +2598,13 @@
           <w:b/>
           <w:color w:val="1A1A1A"/>
         </w:rPr>
-        <w:t>8.89%</w:t>
+        <w:t>0.38</w:t>
       </w:r>
       <w:r>
         <w:rPr>
           <w:rFonts w:ascii="Microsoft YaHei" w:hAnsi="Microsoft YaHei"/>
         </w:rPr>
-        <w:t>。</w:t>
+        <w:t>），但须关注两个间接影响路径：</w:t>
       </w:r>
     </w:p>
     <w:p>
@@ -2787,50 +2614,16 @@
       <w:r>
         <w:rPr>
           <w:rFonts w:ascii="Microsoft YaHei" w:hAnsi="Microsoft YaHei"/>
-        </w:rPr>
-        <w:t xml:space="preserve">国际原油期货结算价大幅收跌超 </w:t>
-      </w:r>
-      <w:r>
-        <w:rPr>
-          <w:rFonts w:ascii="Microsoft YaHei" w:hAnsi="Microsoft YaHei"/>
           <w:b/>
           <w:color w:val="1A1A1A"/>
         </w:rPr>
-        <w:t>4%</w:t>
+        <w:t>航空燃油成本</w:t>
       </w:r>
       <w:r>
         <w:rPr>
           <w:rFonts w:ascii="Microsoft YaHei" w:hAnsi="Microsoft YaHei"/>
         </w:rPr>
-        <w:t xml:space="preserve">，WTI原油跌 </w:t>
-      </w:r>
-      <w:r>
-        <w:rPr>
-          <w:rFonts w:ascii="Microsoft YaHei" w:hAnsi="Microsoft YaHei"/>
-          <w:b/>
-          <w:color w:val="1A1A1A"/>
-        </w:rPr>
-        <w:t>4.06%</w:t>
-      </w:r>
-      <w:r>
-        <w:rPr>
-          <w:rFonts w:ascii="Microsoft YaHei" w:hAnsi="Microsoft YaHei"/>
-        </w:rPr>
-        <w:t xml:space="preserve">，布伦特原油跌 </w:t>
-      </w:r>
-      <w:r>
-        <w:rPr>
-          <w:rFonts w:ascii="Microsoft YaHei" w:hAnsi="Microsoft YaHei"/>
-          <w:b/>
-          <w:color w:val="1A1A1A"/>
-        </w:rPr>
-        <w:t>4.83%</w:t>
-      </w:r>
-      <w:r>
-        <w:rPr>
-          <w:rFonts w:ascii="Microsoft YaHei" w:hAnsi="Microsoft YaHei"/>
-        </w:rPr>
-        <w:t>。</w:t>
+        <w:t>：国际原油价格大幅下跌，有助于降低航空公司燃油成本，进而利好机场的航空性业务收入预期</w:t>
       </w:r>
     </w:p>
     <w:p>
@@ -2840,22 +2633,16 @@
       <w:r>
         <w:rPr>
           <w:rFonts w:ascii="Microsoft YaHei" w:hAnsi="Microsoft YaHei"/>
-        </w:rPr>
-        <w:t xml:space="preserve">COMEX黄金期货跌 </w:t>
-      </w:r>
-      <w:r>
-        <w:rPr>
-          <w:rFonts w:ascii="Microsoft YaHei" w:hAnsi="Microsoft YaHei"/>
           <w:b/>
           <w:color w:val="1A1A1A"/>
         </w:rPr>
-        <w:t>1.11%</w:t>
+        <w:t>地缘缓和</w:t>
       </w:r>
       <w:r>
         <w:rPr>
           <w:rFonts w:ascii="Microsoft YaHei" w:hAnsi="Microsoft YaHei"/>
         </w:rPr>
-        <w:t>。</w:t>
+        <w:t>：霍尔木兹海峡相关消息显示地缘博弈有所缓和，利于全球航空出行信心的恢复</w:t>
       </w:r>
     </w:p>
     <w:p>
@@ -2865,185 +2652,7 @@
           <w:b/>
           <w:color w:val="1A1A1A"/>
         </w:rPr>
-        <w:t>影响分析：</w:t>
-      </w:r>
-      <w:r>
-        <w:rPr>
-          <w:rFonts w:ascii="Microsoft YaHei" w:hAnsi="Microsoft YaHei"/>
-        </w:rPr>
-        <w:t xml:space="preserve"> 该快讯通过关键词"航运""桥梁"匹配，与上海机场的直接业务关联度较低。但霍尔木兹海峡航运议题涉及全球供应链稳定性，对航空货运的间接影响需关注。原油大跌有利于降低航空公司及机场运营的燃油相关成本，对上海机场所在产业链构成 </w:t>
-      </w:r>
-      <w:r>
-        <w:rPr>
-          <w:rFonts w:ascii="Microsoft YaHei" w:hAnsi="Microsoft YaHei"/>
-          <w:b/>
-          <w:color w:val="1A1A1A"/>
-        </w:rPr>
-        <w:t>偏正面</w:t>
-      </w:r>
-      <w:r>
-        <w:rPr>
-          <w:rFonts w:ascii="Microsoft YaHei" w:hAnsi="Microsoft YaHei"/>
-        </w:rPr>
-        <w:t xml:space="preserve"> 情绪引导。</w:t>
-      </w:r>
-    </w:p>
-    <w:p>
-      <w:r>
-        <w:rPr>
-          <w:rFonts w:ascii="Microsoft YaHei" w:hAnsi="Microsoft YaHei"/>
-          <w:b/>
-          <w:color w:val="1A1A1A"/>
-        </w:rPr>
-        <w:t>2. 盘中异动监测</w:t>
-      </w:r>
-    </w:p>
-    <w:p>
-      <w:pPr>
-        <w:pStyle w:val="ListBullet"/>
-      </w:pPr>
-      <w:r>
-        <w:rPr>
-          <w:rFonts w:ascii="Microsoft YaHei" w:hAnsi="Microsoft YaHei"/>
-        </w:rPr>
-        <w:t xml:space="preserve">10:57:39 出现大卖盘，当时价位在 </w:t>
-      </w:r>
-      <w:r>
-        <w:rPr>
-          <w:rFonts w:ascii="Microsoft YaHei" w:hAnsi="Microsoft YaHei"/>
-          <w:b/>
-          <w:color w:val="1A1A1A"/>
-        </w:rPr>
-        <w:t>24.43元</w:t>
-      </w:r>
-      <w:r>
-        <w:rPr>
-          <w:rFonts w:ascii="Microsoft YaHei" w:hAnsi="Microsoft YaHei"/>
-        </w:rPr>
-        <w:t xml:space="preserve">附近（该价格高于系统记录的最高价24.02元，或为瞬时脉冲交易）。该异动后股价有所回落，最终收于23.94元，显示 </w:t>
-      </w:r>
-      <w:r>
-        <w:rPr>
-          <w:rFonts w:ascii="Microsoft YaHei" w:hAnsi="Microsoft YaHei"/>
-          <w:b/>
-          <w:color w:val="1A1A1A"/>
-        </w:rPr>
-        <w:t>24元上方存在一定抛压</w:t>
-      </w:r>
-      <w:r>
-        <w:rPr>
-          <w:rFonts w:ascii="Microsoft YaHei" w:hAnsi="Microsoft YaHei"/>
-        </w:rPr>
-        <w:t>。</w:t>
-      </w:r>
-    </w:p>
-    <w:p>
-      <w:r>
-        <w:rPr>
-          <w:rFonts w:ascii="Microsoft YaHei" w:hAnsi="Microsoft YaHei"/>
-          <w:b/>
-          <w:color w:val="1A1A1A"/>
-        </w:rPr>
-        <w:t>3. 融资相关快讯</w:t>
-      </w:r>
-    </w:p>
-    <w:p>
-      <w:pPr>
-        <w:pStyle w:val="ListBullet"/>
-      </w:pPr>
-      <w:r>
-        <w:rPr>
-          <w:rFonts w:ascii="Microsoft YaHei" w:hAnsi="Microsoft YaHei"/>
-        </w:rPr>
-        <w:t xml:space="preserve">融资余额 </w:t>
-      </w:r>
-      <w:r>
-        <w:rPr>
-          <w:rFonts w:ascii="Microsoft YaHei" w:hAnsi="Microsoft YaHei"/>
-          <w:b/>
-          <w:color w:val="1A1A1A"/>
-        </w:rPr>
-        <w:t>16.71亿元</w:t>
-      </w:r>
-      <w:r>
-        <w:rPr>
-          <w:rFonts w:ascii="Microsoft YaHei" w:hAnsi="Microsoft YaHei"/>
-        </w:rPr>
-        <w:t xml:space="preserve">，占流通市值比例 </w:t>
-      </w:r>
-      <w:r>
-        <w:rPr>
-          <w:rFonts w:ascii="Microsoft YaHei" w:hAnsi="Microsoft YaHei"/>
-          <w:b/>
-          <w:color w:val="1A1A1A"/>
-        </w:rPr>
-        <w:t>3.40%</w:t>
-      </w:r>
-      <w:r>
-        <w:rPr>
-          <w:rFonts w:ascii="Microsoft YaHei" w:hAnsi="Microsoft YaHei"/>
-        </w:rPr>
-        <w:t xml:space="preserve">，超过近一年60%分位水平。融资净买入额为 </w:t>
-      </w:r>
-      <w:r>
-        <w:rPr>
-          <w:rFonts w:ascii="Microsoft YaHei" w:hAnsi="Microsoft YaHei"/>
-          <w:b/>
-          <w:color w:val="1A1A1A"/>
-        </w:rPr>
-        <w:t>-757.4万元</w:t>
-      </w:r>
-      <w:r>
-        <w:rPr>
-          <w:rFonts w:ascii="Microsoft YaHei" w:hAnsi="Microsoft YaHei"/>
-        </w:rPr>
-        <w:t>，呈小幅净偿还状态，说明融资客在持续回调后有部分兑现动作。</w:t>
-      </w:r>
-    </w:p>
-    <w:p>
-      <w:r>
-        <w:rPr>
-          <w:rFonts w:ascii="Microsoft YaHei" w:hAnsi="Microsoft YaHei"/>
-          <w:b/>
-          <w:color w:val="1A1A1A"/>
-        </w:rPr>
-        <w:t>4. 限售股解禁与分红潮（外部分析）</w:t>
-      </w:r>
-    </w:p>
-    <w:p>
-      <w:pPr>
-        <w:pStyle w:val="ListBullet"/>
-      </w:pPr>
-      <w:r>
-        <w:rPr>
-          <w:rFonts w:ascii="Microsoft YaHei" w:hAnsi="Microsoft YaHei"/>
-        </w:rPr>
-        <w:t xml:space="preserve">今日全市场有 </w:t>
-      </w:r>
-      <w:r>
-        <w:rPr>
-          <w:rFonts w:ascii="Microsoft YaHei" w:hAnsi="Microsoft YaHei"/>
-          <w:b/>
-          <w:color w:val="1A1A1A"/>
-        </w:rPr>
-        <w:t>109.01亿元</w:t>
-      </w:r>
-      <w:r>
-        <w:rPr>
-          <w:rFonts w:ascii="Microsoft YaHei" w:hAnsi="Microsoft YaHei"/>
-        </w:rPr>
-        <w:t xml:space="preserve"> 市值限售股解禁。上海机场近期是否有解禁需关注正式公告。</w:t>
-      </w:r>
-    </w:p>
-    <w:p>
-      <w:pPr>
-        <w:pStyle w:val="ListBullet"/>
-      </w:pPr>
-      <w:r>
-        <w:rPr>
-          <w:rFonts w:ascii="Microsoft YaHei" w:hAnsi="Microsoft YaHei"/>
-        </w:rPr>
-        <w:t>A股分红潮密集来袭，上海机场作为现金流稳定的核心枢纽资产，若涉及分红方案，对股价具正面支撑。</w:t>
+        <w:t>整体看，该资讯对上海机场偏正面。</w:t>
       </w:r>
     </w:p>
     <w:p>
@@ -3069,20 +2678,6 @@
           <w:sz w:val="28"/>
         </w:rPr>
         <w:t>板块关联</w:t>
-      </w:r>
-    </w:p>
-    <w:p>
-      <w:pPr>
-        <w:spacing w:before="280" w:after="80" w:line="312" w:lineRule="auto"/>
-      </w:pPr>
-      <w:r>
-        <w:rPr>
-          <w:rFonts w:ascii="Microsoft YaHei" w:hAnsi="Microsoft YaHei"/>
-          <w:b/>
-          <w:color w:val="333333"/>
-          <w:sz w:val="24"/>
-        </w:rPr>
-        <w:t>所属板块表现一览</w:t>
       </w:r>
     </w:p>
     <w:tbl>
@@ -3117,7 +2712,7 @@
                 <w:color w:val="1A1A1A"/>
                 <w:sz w:val="18"/>
               </w:rPr>
-              <w:t>板块名称</w:t>
+              <w:t>板块</w:t>
             </w:r>
           </w:p>
         </w:tc>
@@ -3159,7 +2754,7 @@
                 <w:color w:val="1A1A1A"/>
                 <w:sz w:val="18"/>
               </w:rPr>
-              <w:t>板块内排名</w:t>
+              <w:t>板块排名</w:t>
             </w:r>
           </w:p>
         </w:tc>
@@ -3180,7 +2775,7 @@
                 <w:color w:val="1A1A1A"/>
                 <w:sz w:val="18"/>
               </w:rPr>
-              <w:t>板块内领涨/领跌</w:t>
+              <w:t>个股排名</w:t>
             </w:r>
           </w:p>
         </w:tc>
@@ -3238,18 +2833,9 @@
             <w:r>
               <w:rPr>
                 <w:rFonts w:ascii="Microsoft YaHei" w:hAnsi="Microsoft YaHei"/>
-                <w:b/>
-                <w:color w:val="1A1A1A"/>
                 <w:sz w:val="18"/>
               </w:rPr>
-              <w:t>1/4</w:t>
-            </w:r>
-            <w:r>
-              <w:rPr>
-                <w:rFonts w:ascii="Microsoft YaHei" w:hAnsi="Microsoft YaHei"/>
-                <w:sz w:val="18"/>
-              </w:rPr>
-              <w:t>（领涨）</w:t>
+              <w:t>128/1158</w:t>
             </w:r>
           </w:p>
         </w:tc>
@@ -3265,9 +2851,11 @@
             <w:r>
               <w:rPr>
                 <w:rFonts w:ascii="Microsoft YaHei" w:hAnsi="Microsoft YaHei"/>
+                <w:b/>
+                <w:color w:val="1A1A1A"/>
                 <w:sz w:val="18"/>
               </w:rPr>
-              <w:t>上海机场+1.48%领涨，板块内4只个股全涨</w:t>
+              <w:t>1/4（领涨）</w:t>
             </w:r>
           </w:p>
         </w:tc>
@@ -3326,7 +2914,7 @@
                 <w:rFonts w:ascii="Microsoft YaHei" w:hAnsi="Microsoft YaHei"/>
                 <w:sz w:val="18"/>
               </w:rPr>
-              <w:t>17/47</w:t>
+              <w:t>137/1158</w:t>
             </w:r>
           </w:p>
         </w:tc>
@@ -3345,7 +2933,7 @@
                 <w:rFonts w:ascii="Microsoft YaHei" w:hAnsi="Microsoft YaHei"/>
                 <w:sz w:val="18"/>
               </w:rPr>
-              <w:t>皖通高速+8.87%领涨</w:t>
+              <w:t>17/47</w:t>
             </w:r>
           </w:p>
         </w:tc>
@@ -3401,7 +2989,7 @@
                 <w:rFonts w:ascii="Microsoft YaHei" w:hAnsi="Microsoft YaHei"/>
                 <w:sz w:val="18"/>
               </w:rPr>
-              <w:t>38/121</w:t>
+              <w:t>219/1158</w:t>
             </w:r>
           </w:p>
         </w:tc>
@@ -3419,7 +3007,7 @@
                 <w:rFonts w:ascii="Microsoft YaHei" w:hAnsi="Microsoft YaHei"/>
                 <w:sz w:val="18"/>
               </w:rPr>
-              <w:t>皖通高速+8.87%领涨</w:t>
+              <w:t>38/121</w:t>
             </w:r>
           </w:p>
         </w:tc>
@@ -3457,8 +3045,6 @@
             <w:r>
               <w:rPr>
                 <w:rFonts w:ascii="Microsoft YaHei" w:hAnsi="Microsoft YaHei"/>
-                <w:b/>
-                <w:color w:val="1A1A1A"/>
                 <w:sz w:val="18"/>
               </w:rPr>
               <w:t>+1.57%</w:t>
@@ -3480,7 +3066,7 @@
                 <w:rFonts w:ascii="Microsoft YaHei" w:hAnsi="Microsoft YaHei"/>
                 <w:sz w:val="18"/>
               </w:rPr>
-              <w:t>209/319</w:t>
+              <w:t>75/1158</w:t>
             </w:r>
           </w:p>
         </w:tc>
@@ -3499,7 +3085,7 @@
                 <w:rFonts w:ascii="Microsoft YaHei" w:hAnsi="Microsoft YaHei"/>
                 <w:sz w:val="18"/>
               </w:rPr>
-              <w:t>中国海油+10.01%领涨</w:t>
+              <w:t>209/319</w:t>
             </w:r>
           </w:p>
         </w:tc>
@@ -3535,8 +3121,6 @@
             <w:r>
               <w:rPr>
                 <w:rFonts w:ascii="Microsoft YaHei" w:hAnsi="Microsoft YaHei"/>
-                <w:b/>
-                <w:color w:val="1A1A1A"/>
                 <w:sz w:val="18"/>
               </w:rPr>
               <w:t>-2.31%</w:t>
@@ -3555,11 +3139,9 @@
             <w:r>
               <w:rPr>
                 <w:rFonts w:ascii="Microsoft YaHei" w:hAnsi="Microsoft YaHei"/>
-                <w:b/>
-                <w:color w:val="1A1A1A"/>
                 <w:sz w:val="18"/>
               </w:rPr>
-              <w:t>7/56</w:t>
+              <w:t>689/1158</w:t>
             </w:r>
           </w:p>
         </w:tc>
@@ -3577,87 +3159,7 @@
                 <w:rFonts w:ascii="Microsoft YaHei" w:hAnsi="Microsoft YaHei"/>
                 <w:sz w:val="18"/>
               </w:rPr>
-              <w:t>中芯国际+2.95%领涨</w:t>
-            </w:r>
-          </w:p>
-        </w:tc>
-      </w:tr>
-      <w:tr>
-        <w:tc>
-          <w:tcPr>
-            <w:tcW w:type="dxa" w:w="2266"/>
-            <w:shd w:fill="F8F9FA" w:val="clear"/>
-          </w:tcPr>
-          <w:p>
-            <w:pPr>
-              <w:spacing w:before="40" w:after="40" w:line="288" w:lineRule="auto"/>
-            </w:pPr>
-            <w:r/>
-            <w:r>
-              <w:rPr>
-                <w:rFonts w:ascii="Microsoft YaHei" w:hAnsi="Microsoft YaHei"/>
-                <w:sz w:val="18"/>
-              </w:rPr>
-              <w:t>工业(A股)</w:t>
-            </w:r>
-          </w:p>
-        </w:tc>
-        <w:tc>
-          <w:tcPr>
-            <w:tcW w:type="dxa" w:w="2266"/>
-            <w:shd w:fill="F8F9FA" w:val="clear"/>
-          </w:tcPr>
-          <w:p>
-            <w:pPr>
-              <w:spacing w:before="40" w:after="40" w:line="288" w:lineRule="auto"/>
-            </w:pPr>
-            <w:r/>
-            <w:r>
-              <w:rPr>
-                <w:rFonts w:ascii="Microsoft YaHei" w:hAnsi="Microsoft YaHei"/>
-                <w:b/>
-                <w:color w:val="1A1A1A"/>
-                <w:sz w:val="18"/>
-              </w:rPr>
-              <w:t>-2.77%</w:t>
-            </w:r>
-          </w:p>
-        </w:tc>
-        <w:tc>
-          <w:tcPr>
-            <w:tcW w:type="dxa" w:w="2266"/>
-            <w:shd w:fill="F8F9FA" w:val="clear"/>
-          </w:tcPr>
-          <w:p>
-            <w:pPr>
-              <w:spacing w:before="40" w:after="40" w:line="288" w:lineRule="auto"/>
-            </w:pPr>
-            <w:r/>
-            <w:r>
-              <w:rPr>
-                <w:rFonts w:ascii="Microsoft YaHei" w:hAnsi="Microsoft YaHei"/>
-                <w:sz w:val="18"/>
-              </w:rPr>
-              <w:t>205/1209</w:t>
-            </w:r>
-          </w:p>
-        </w:tc>
-        <w:tc>
-          <w:tcPr>
-            <w:tcW w:type="dxa" w:w="2266"/>
-            <w:shd w:fill="F8F9FA" w:val="clear"/>
-          </w:tcPr>
-          <w:p>
-            <w:pPr>
-              <w:spacing w:before="40" w:after="40" w:line="288" w:lineRule="auto"/>
-            </w:pPr>
-            <w:r/>
-            <w:r>
-              <w:rPr>
-                <w:rFonts w:ascii="Microsoft YaHei" w:hAnsi="Microsoft YaHei"/>
-                <w:sz w:val="18"/>
-              </w:rPr>
-              <w:t>板块整体偏弱</w:t>
+              <w:t>7/56</w:t>
             </w:r>
           </w:p>
         </w:tc>
@@ -3671,26 +3173,27 @@
           <w:b/>
           <w:color w:val="1A1A1A"/>
         </w:rPr>
-        <w:t>板块关联分析：</w:t>
+        <w:t>板块亮点</w:t>
       </w:r>
-    </w:p>
-    <w:p>
-      <w:pPr>
-        <w:pStyle w:val="ListBullet"/>
-      </w:pPr>
+      <w:r>
+        <w:rPr>
+          <w:rFonts w:ascii="Microsoft YaHei" w:hAnsi="Microsoft YaHei"/>
+        </w:rPr>
+        <w:t>：上海机场在</w:t>
+      </w:r>
       <w:r>
         <w:rPr>
           <w:rFonts w:ascii="Microsoft YaHei" w:hAnsi="Microsoft YaHei"/>
           <w:b/>
           <w:color w:val="1A1A1A"/>
         </w:rPr>
-        <w:t>机场服务板块领涨</w:t>
+        <w:t>机场服务板块</w:t>
       </w:r>
       <w:r>
         <w:rPr>
           <w:rFonts w:ascii="Microsoft YaHei" w:hAnsi="Microsoft YaHei"/>
         </w:rPr>
-        <w:t xml:space="preserve">：上海机场以 </w:t>
+        <w:t xml:space="preserve">中以 </w:t>
       </w:r>
       <w:r>
         <w:rPr>
@@ -3704,7 +3207,7 @@
         <w:rPr>
           <w:rFonts w:ascii="Microsoft YaHei" w:hAnsi="Microsoft YaHei"/>
         </w:rPr>
-        <w:t xml:space="preserve"> 的涨幅领跑机场服务板块（+0.96%），该板块仅4只成分股且 </w:t>
+        <w:t xml:space="preserve"> 的涨幅位居首位，跑赢同行深圳机场（+1.37%）、白云机场（+0.63%）和厦门空港（+0.35%），体现出</w:t>
       </w:r>
       <w:r>
         <w:rPr>
@@ -3712,79 +3215,13 @@
           <w:b/>
           <w:color w:val="1A1A1A"/>
         </w:rPr>
-        <w:t>全线上涨</w:t>
+        <w:t>龙头领涨效应</w:t>
       </w:r>
       <w:r>
         <w:rPr>
           <w:rFonts w:ascii="Microsoft YaHei" w:hAnsi="Microsoft YaHei"/>
         </w:rPr>
-        <w:t>（深圳机场+1.37%、白云机场+0.63%、厦门空港+0.35%），行业整体情绪向好。</w:t>
-      </w:r>
-    </w:p>
-    <w:p>
-      <w:pPr>
-        <w:pStyle w:val="ListBullet"/>
-      </w:pPr>
-      <w:r>
-        <w:rPr>
-          <w:rFonts w:ascii="Microsoft YaHei" w:hAnsi="Microsoft YaHei"/>
-          <w:b/>
-          <w:color w:val="1A1A1A"/>
-        </w:rPr>
-        <w:t>沪深300样本股走强</w:t>
-      </w:r>
-      <w:r>
-        <w:rPr>
-          <w:rFonts w:ascii="Microsoft YaHei" w:hAnsi="Microsoft YaHei"/>
-        </w:rPr>
-        <w:t xml:space="preserve">：该板块整体 </w:t>
-      </w:r>
-      <w:r>
-        <w:rPr>
-          <w:rFonts w:ascii="Microsoft YaHei" w:hAnsi="Microsoft YaHei"/>
-          <w:b/>
-          <w:color w:val="1A1A1A"/>
-        </w:rPr>
-        <w:t>+1.57%</w:t>
-      </w:r>
-      <w:r>
-        <w:rPr>
-          <w:rFonts w:ascii="Microsoft YaHei" w:hAnsi="Microsoft YaHei"/>
-        </w:rPr>
-        <w:t>，上海机场在319只成分股中排名第209位，涨幅相对温和但跑赢多数个股。</w:t>
-      </w:r>
-    </w:p>
-    <w:p>
-      <w:pPr>
-        <w:pStyle w:val="ListBullet"/>
-      </w:pPr>
-      <w:r>
-        <w:rPr>
-          <w:rFonts w:ascii="Microsoft YaHei" w:hAnsi="Microsoft YaHei"/>
-          <w:b/>
-          <w:color w:val="1A1A1A"/>
-        </w:rPr>
-        <w:t>上海自贸区板块逆市下跌2.31%</w:t>
-      </w:r>
-      <w:r>
-        <w:rPr>
-          <w:rFonts w:ascii="Microsoft YaHei" w:hAnsi="Microsoft YaHei"/>
-        </w:rPr>
-        <w:t xml:space="preserve">，但上海机场在该板块内排名 </w:t>
-      </w:r>
-      <w:r>
-        <w:rPr>
-          <w:rFonts w:ascii="Microsoft YaHei" w:hAnsi="Microsoft YaHei"/>
-          <w:b/>
-          <w:color w:val="1A1A1A"/>
-        </w:rPr>
-        <w:t>第7/56</w:t>
-      </w:r>
-      <w:r>
-        <w:rPr>
-          <w:rFonts w:ascii="Microsoft YaHei" w:hAnsi="Microsoft YaHei"/>
-        </w:rPr>
-        <w:t>，表现相对强势，逆势抗跌。</w:t>
+        <w:t>。</w:t>
       </w:r>
     </w:p>
     <w:p>
@@ -3864,7 +3301,7 @@
                 <w:color w:val="1A1A1A"/>
                 <w:sz w:val="18"/>
               </w:rPr>
-              <w:t>评分（五星制）</w:t>
+              <w:t>评分</w:t>
             </w:r>
           </w:p>
         </w:tc>
@@ -3885,7 +3322,7 @@
                 <w:color w:val="1A1A1A"/>
                 <w:sz w:val="18"/>
               </w:rPr>
-              <w:t>简要说明</w:t>
+              <w:t>说明</w:t>
             </w:r>
           </w:p>
         </w:tc>
@@ -3905,7 +3342,7 @@
                 <w:rFonts w:ascii="Microsoft YaHei" w:hAnsi="Microsoft YaHei"/>
                 <w:sz w:val="18"/>
               </w:rPr>
-              <w:t>价量关系</w:t>
+              <w:t>市场情绪</w:t>
             </w:r>
           </w:p>
         </w:tc>
@@ -3923,7 +3360,7 @@
                 <w:rFonts w:ascii="Microsoft YaHei" w:hAnsi="Microsoft YaHei"/>
                 <w:sz w:val="18"/>
               </w:rPr>
-              <w:t>★★★★☆</w:t>
+              <w:t>⭐⭐⭐⭐⭐</w:t>
             </w:r>
           </w:p>
         </w:tc>
@@ -3941,7 +3378,7 @@
                 <w:rFonts w:ascii="Microsoft YaHei" w:hAnsi="Microsoft YaHei"/>
                 <w:sz w:val="18"/>
               </w:rPr>
-              <w:t>放量上涨，外盘大于内盘，价量配合良好</w:t>
+              <w:t>全市场普涨，热度高</w:t>
             </w:r>
           </w:p>
         </w:tc>
@@ -3962,7 +3399,7 @@
                 <w:rFonts w:ascii="Microsoft YaHei" w:hAnsi="Microsoft YaHei"/>
                 <w:sz w:val="18"/>
               </w:rPr>
-              <w:t>资金面</w:t>
+              <w:t>量价配合</w:t>
             </w:r>
           </w:p>
         </w:tc>
@@ -3981,7 +3418,7 @@
                 <w:rFonts w:ascii="Microsoft YaHei" w:hAnsi="Microsoft YaHei"/>
                 <w:sz w:val="18"/>
               </w:rPr>
-              <w:t>★★★★☆</w:t>
+              <w:t>⭐⭐⭐⭐</w:t>
             </w:r>
           </w:p>
         </w:tc>
@@ -4000,7 +3437,7 @@
                 <w:rFonts w:ascii="Microsoft YaHei" w:hAnsi="Microsoft YaHei"/>
                 <w:sz w:val="18"/>
               </w:rPr>
-              <w:t>今日持续净流入4549万，大单、中单连续两日净买入</w:t>
+              <w:t>放量上涨，交投活跃</w:t>
             </w:r>
           </w:p>
         </w:tc>
@@ -4020,7 +3457,7 @@
                 <w:rFonts w:ascii="Microsoft YaHei" w:hAnsi="Microsoft YaHei"/>
                 <w:sz w:val="18"/>
               </w:rPr>
-              <w:t>技术面</w:t>
+              <w:t>资金动向</w:t>
             </w:r>
           </w:p>
         </w:tc>
@@ -4038,7 +3475,7 @@
                 <w:rFonts w:ascii="Microsoft YaHei" w:hAnsi="Microsoft YaHei"/>
                 <w:sz w:val="18"/>
               </w:rPr>
-              <w:t>★★★★☆</w:t>
+              <w:t>⭐⭐⭐⭐⭐</w:t>
             </w:r>
           </w:p>
         </w:tc>
@@ -4056,7 +3493,7 @@
                 <w:rFonts w:ascii="Microsoft YaHei" w:hAnsi="Microsoft YaHei"/>
                 <w:sz w:val="18"/>
               </w:rPr>
-              <w:t>站上MA5/MA10/MA20三线，多头排列初成，逼近布林上轨</w:t>
+              <w:t>大单+中单持续净流入</w:t>
             </w:r>
           </w:p>
         </w:tc>
@@ -4077,7 +3514,7 @@
                 <w:rFonts w:ascii="Microsoft YaHei" w:hAnsi="Microsoft YaHei"/>
                 <w:sz w:val="18"/>
               </w:rPr>
-              <w:t>板块联动</w:t>
+              <w:t>技术形态</w:t>
             </w:r>
           </w:p>
         </w:tc>
@@ -4096,7 +3533,7 @@
                 <w:rFonts w:ascii="Microsoft YaHei" w:hAnsi="Microsoft YaHei"/>
                 <w:sz w:val="18"/>
               </w:rPr>
-              <w:t>★★★★☆</w:t>
+              <w:t>⭐⭐⭐⭐</w:t>
             </w:r>
           </w:p>
         </w:tc>
@@ -4115,7 +3552,7 @@
                 <w:rFonts w:ascii="Microsoft YaHei" w:hAnsi="Microsoft YaHei"/>
                 <w:sz w:val="18"/>
               </w:rPr>
-              <w:t>机场服务板块领涨，个股板块内排名第一</w:t>
+              <w:t>多头排列，贴近上轨</w:t>
             </w:r>
           </w:p>
         </w:tc>
@@ -4135,7 +3572,7 @@
                 <w:rFonts w:ascii="Microsoft YaHei" w:hAnsi="Microsoft YaHei"/>
                 <w:sz w:val="18"/>
               </w:rPr>
-              <w:t>消息面</w:t>
+              <w:t>板块效应</w:t>
             </w:r>
           </w:p>
         </w:tc>
@@ -4153,7 +3590,7 @@
                 <w:rFonts w:ascii="Microsoft YaHei" w:hAnsi="Microsoft YaHei"/>
                 <w:sz w:val="18"/>
               </w:rPr>
-              <w:t>★★★☆☆</w:t>
+              <w:t>⭐⭐⭐⭐</w:t>
             </w:r>
           </w:p>
         </w:tc>
@@ -4171,7 +3608,66 @@
                 <w:rFonts w:ascii="Microsoft YaHei" w:hAnsi="Microsoft YaHei"/>
                 <w:sz w:val="18"/>
               </w:rPr>
-              <w:t>隔夜消息偏中性，油价下跌偏正面，融资余额高位略降</w:t>
+              <w:t>领涨机场板块</w:t>
+            </w:r>
+          </w:p>
+        </w:tc>
+      </w:tr>
+      <w:tr>
+        <w:tc>
+          <w:tcPr>
+            <w:tcW w:type="dxa" w:w="3022"/>
+            <w:shd w:fill="F8F9FA" w:val="clear"/>
+          </w:tcPr>
+          <w:p>
+            <w:pPr>
+              <w:spacing w:before="40" w:after="40" w:line="288" w:lineRule="auto"/>
+            </w:pPr>
+            <w:r/>
+            <w:r>
+              <w:rPr>
+                <w:rFonts w:ascii="Microsoft YaHei" w:hAnsi="Microsoft YaHei"/>
+                <w:sz w:val="18"/>
+              </w:rPr>
+              <w:t>消息面</w:t>
+            </w:r>
+          </w:p>
+        </w:tc>
+        <w:tc>
+          <w:tcPr>
+            <w:tcW w:type="dxa" w:w="3022"/>
+            <w:shd w:fill="F8F9FA" w:val="clear"/>
+          </w:tcPr>
+          <w:p>
+            <w:pPr>
+              <w:spacing w:before="40" w:after="40" w:line="288" w:lineRule="auto"/>
+            </w:pPr>
+            <w:r/>
+            <w:r>
+              <w:rPr>
+                <w:rFonts w:ascii="Microsoft YaHei" w:hAnsi="Microsoft YaHei"/>
+                <w:sz w:val="18"/>
+              </w:rPr>
+              <w:t>⭐⭐⭐</w:t>
+            </w:r>
+          </w:p>
+        </w:tc>
+        <w:tc>
+          <w:tcPr>
+            <w:tcW w:type="dxa" w:w="3022"/>
+            <w:shd w:fill="F8F9FA" w:val="clear"/>
+          </w:tcPr>
+          <w:p>
+            <w:pPr>
+              <w:spacing w:before="40" w:after="40" w:line="288" w:lineRule="auto"/>
+            </w:pPr>
+            <w:r/>
+            <w:r>
+              <w:rPr>
+                <w:rFonts w:ascii="Microsoft YaHei" w:hAnsi="Microsoft YaHei"/>
+                <w:sz w:val="18"/>
+              </w:rPr>
+              <w:t>偏正面但影响有限</w:t>
             </w:r>
           </w:p>
         </w:tc>
@@ -4185,15 +3681,13 @@
           <w:b/>
           <w:color w:val="1A1A1A"/>
         </w:rPr>
-        <w:t>主力观点：</w:t>
+        <w:t>主力观点</w:t>
       </w:r>
-    </w:p>
-    <w:p>
       <w:r>
         <w:rPr>
           <w:rFonts w:ascii="Microsoft YaHei" w:hAnsi="Microsoft YaHei"/>
         </w:rPr>
-        <w:t xml:space="preserve">上海机场今日呈现 </w:t>
+        <w:t>：上海机场今日走势稳健，呈现</w:t>
       </w:r>
       <w:r>
         <w:rPr>
@@ -4201,13 +3695,13 @@
           <w:b/>
           <w:color w:val="1A1A1A"/>
         </w:rPr>
-        <w:t>量价齐升</w:t>
+        <w:t>量价齐升、资金净流入、技术多头</w:t>
       </w:r>
       <w:r>
         <w:rPr>
           <w:rFonts w:ascii="Microsoft YaHei" w:hAnsi="Microsoft YaHei"/>
         </w:rPr>
-        <w:t xml:space="preserve"> 的稳健态势。半日换手率达 </w:t>
+        <w:t xml:space="preserve">的良好组合。盘中虽有单笔大卖盘异动（10:57:39，价格触及24.43元），但并未改变整体上攻态势。当前股价距布林带上轨约 </w:t>
       </w:r>
       <w:r>
         <w:rPr>
@@ -4215,13 +3709,13 @@
           <w:b/>
           <w:color w:val="1A1A1A"/>
         </w:rPr>
-        <w:t>0.72%</w:t>
+        <w:t>1.3%</w:t>
       </w:r>
       <w:r>
         <w:rPr>
           <w:rFonts w:ascii="Microsoft YaHei" w:hAnsi="Microsoft YaHei"/>
         </w:rPr>
-        <w:t xml:space="preserve">、量比 </w:t>
+        <w:t xml:space="preserve">，短线或面临一定技术压力，但在全市场情绪高涨、机场板块领涨的背景下，后续有望继续向 </w:t>
       </w:r>
       <w:r>
         <w:rPr>
@@ -4229,77 +3723,13 @@
           <w:b/>
           <w:color w:val="1A1A1A"/>
         </w:rPr>
-        <w:t>1.05</w:t>
+        <w:t>24.26元（布林上轨）</w:t>
       </w:r>
       <w:r>
         <w:rPr>
           <w:rFonts w:ascii="Microsoft YaHei" w:hAnsi="Microsoft YaHei"/>
         </w:rPr>
-        <w:t xml:space="preserve">，叠加资金净流入 </w:t>
-      </w:r>
-      <w:r>
-        <w:rPr>
-          <w:rFonts w:ascii="Microsoft YaHei" w:hAnsi="Microsoft YaHei"/>
-          <w:b/>
-          <w:color w:val="1A1A1A"/>
-        </w:rPr>
-        <w:t>4,548.74万元</w:t>
-      </w:r>
-      <w:r>
-        <w:rPr>
-          <w:rFonts w:ascii="Microsoft YaHei" w:hAnsi="Microsoft YaHei"/>
-        </w:rPr>
-        <w:t>，交投活跃度与资金参与度均有明显提升。技术面上，股价站稳MA5/MA10/MA20均线系统上方，短期多头趋势初步确立。</w:t>
-      </w:r>
-    </w:p>
-    <w:p>
-      <w:r>
-        <w:rPr>
-          <w:rFonts w:ascii="Microsoft YaHei" w:hAnsi="Microsoft YaHei"/>
-        </w:rPr>
-        <w:t>需关注的风险点在于：</w:t>
-      </w:r>
-      <w:r>
-        <w:rPr>
-          <w:rFonts w:ascii="Microsoft YaHei" w:hAnsi="Microsoft YaHei"/>
-          <w:b/>
-          <w:color w:val="1A1A1A"/>
-        </w:rPr>
-        <w:t>24元上方抛压显现</w:t>
-      </w:r>
-      <w:r>
-        <w:rPr>
-          <w:rFonts w:ascii="Microsoft YaHei" w:hAnsi="Microsoft YaHei"/>
-        </w:rPr>
-        <w:t xml:space="preserve">（盘中异动大卖盘及最高价24.02元后回落），且布林带上轨 </w:t>
-      </w:r>
-      <w:r>
-        <w:rPr>
-          <w:rFonts w:ascii="Microsoft YaHei" w:hAnsi="Microsoft YaHei"/>
-          <w:b/>
-          <w:color w:val="1A1A1A"/>
-        </w:rPr>
-        <w:t>24.26元</w:t>
-      </w:r>
-      <w:r>
-        <w:rPr>
-          <w:rFonts w:ascii="Microsoft YaHei" w:hAnsi="Microsoft YaHei"/>
-        </w:rPr>
-        <w:t xml:space="preserve"> 构成短期阻力。若午后能放量突破 </w:t>
-      </w:r>
-      <w:r>
-        <w:rPr>
-          <w:rFonts w:ascii="Microsoft YaHei" w:hAnsi="Microsoft YaHei"/>
-          <w:b/>
-          <w:color w:val="1A1A1A"/>
-        </w:rPr>
-        <w:t>24.02-24.26元</w:t>
-      </w:r>
-      <w:r>
-        <w:rPr>
-          <w:rFonts w:ascii="Microsoft YaHei" w:hAnsi="Microsoft YaHei"/>
-        </w:rPr>
-        <w:t xml:space="preserve"> 区间，则上行空间进一步打开；若遇阻回落，则需观察 </w:t>
+        <w:t xml:space="preserve"> 乃至更高位置试探。下方 </w:t>
       </w:r>
       <w:r>
         <w:rPr>
@@ -4313,17 +3743,21 @@
         <w:rPr>
           <w:rFonts w:ascii="Microsoft YaHei" w:hAnsi="Microsoft YaHei"/>
         </w:rPr>
-        <w:t xml:space="preserve"> 的支撑力度。</w:t>
+        <w:t xml:space="preserve"> 构成第一支撑，</w:t>
       </w:r>
-    </w:p>
-    <w:p>
       <w:r>
         <w:rPr>
           <w:rFonts w:ascii="Microsoft YaHei" w:hAnsi="Microsoft YaHei"/>
           <w:b/>
           <w:color w:val="1A1A1A"/>
         </w:rPr>
-        <w:t>综合评级：短期偏多，关注24元上方阻力突破情况。</w:t>
+        <w:t>MA10（23.54元）</w:t>
+      </w:r>
+      <w:r>
+        <w:rPr>
+          <w:rFonts w:ascii="Microsoft YaHei" w:hAnsi="Microsoft YaHei"/>
+        </w:rPr>
+        <w:t xml:space="preserve"> 为强支撑。</w:t>
       </w:r>
     </w:p>
     <w:p>
@@ -4331,7 +3765,7 @@
         <w:rPr>
           <w:rFonts w:ascii="Microsoft YaHei" w:hAnsi="Microsoft YaHei"/>
         </w:rPr>
-        <w:t xml:space="preserve">&gt; ⚠️ </w:t>
+        <w:t xml:space="preserve">&gt; </w:t>
       </w:r>
       <w:r>
         <w:rPr>
@@ -4339,13 +3773,13 @@
           <w:b/>
           <w:color w:val="1A1A1A"/>
         </w:rPr>
-        <w:t>风险提示：</w:t>
+        <w:t>风险提示</w:t>
       </w:r>
       <w:r>
         <w:rPr>
           <w:rFonts w:ascii="Microsoft YaHei" w:hAnsi="Microsoft YaHei"/>
         </w:rPr>
-        <w:t xml:space="preserve"> 以上分析仅基于午间数据，不构成投资建议。股市有风险，投资需谨慎。</w:t>
+        <w:t>：以上分析基于午间收盘数据，不构成投资建议。股市有风险，投资需谨慎。</w:t>
       </w:r>
     </w:p>
     <w:sectPr>

</xml_diff>